<commit_message>
Deployed 3972469 with MkDocs version: 1.6.1
</commit_message>
<xml_diff>
--- a/tema1/plantillas/Actividad_1_1_INU_Plantilla.docx
+++ b/tema1/plantillas/Actividad_1_1_INU_Plantilla.docx
@@ -578,6 +578,166 @@
                 <w:szCs w:val="20"/>
               </w:rPr>
               <w:t xml:space="preserve">📸 Salida de aws sts get-caller-identity en tu terminal</w:t>
+            </w:r>
+          </w:p>
+        </w:tc>
+      </w:tr>
+      <w:tr>
+        <w:trPr>
+          <w:trHeight w:val="2400"/>
+        </w:trPr>
+        <w:tc>
+          <w:tcPr>
+            <w:tcW w:type="dxa" w:w="9638"/>
+            <w:tcBorders>
+              <w:top w:val="single" w:color="E0E0E0" w:sz="4"/>
+              <w:left w:val="single" w:color="E0E0E0" w:sz="4"/>
+              <w:bottom w:val="single" w:color="E0E0E0" w:sz="4"/>
+              <w:right w:val="single" w:color="E0E0E0" w:sz="4"/>
+            </w:tcBorders>
+            <w:shd w:fill="FAFAFA" w:val="clear"/>
+            <w:tcMar>
+              <w:top w:type="dxa" w:w="80"/>
+              <w:left w:type="dxa" w:w="160"/>
+              <w:bottom w:type="dxa" w:w="80"/>
+              <w:right w:type="dxa" w:w="160"/>
+            </w:tcMar>
+          </w:tcPr>
+          <w:p>
+            <w:pPr>
+              <w:jc w:val="center"/>
+            </w:pPr>
+            <w:r>
+              <w:rPr>
+                <w:rFonts w:ascii="Arial" w:cs="Arial" w:eastAsia="Arial" w:hAnsi="Arial"/>
+                <w:i/>
+                <w:iCs/>
+                <w:color w:val="757575"/>
+                <w:sz w:val="20"/>
+                <w:szCs w:val="20"/>
+              </w:rPr>
+              <w:t xml:space="preserve">[Pega aquí la captura de pantalla]</w:t>
+            </w:r>
+          </w:p>
+        </w:tc>
+      </w:tr>
+    </w:tbl>
+    <w:p>
+      <w:pPr>
+        <w:spacing w:after="120"/>
+      </w:pPr>
+    </w:p>
+    <w:p>
+      <w:pPr>
+        <w:spacing w:after="100" w:before="120"/>
+      </w:pPr>
+      <w:r>
+        <w:rPr>
+          <w:rFonts w:ascii="Arial" w:cs="Arial" w:eastAsia="Arial" w:hAnsi="Arial"/>
+          <w:color w:val="212121"/>
+          <w:sz w:val="22"/>
+          <w:szCs w:val="22"/>
+        </w:rPr>
+        <w:t xml:space="preserve">Repite la comprobación con aws s3 ls: ¿el listado de buckets coincide entre CLI y consola?</w:t>
+      </w:r>
+    </w:p>
+    <w:tbl>
+      <w:tblPr>
+        <w:tblW w:type="dxa" w:w="9638"/>
+        <w:tblBorders>
+          <w:top w:val="single" w:color="auto" w:sz="4"/>
+          <w:left w:val="single" w:color="auto" w:sz="4"/>
+          <w:bottom w:val="single" w:color="auto" w:sz="4"/>
+          <w:right w:val="single" w:color="auto" w:sz="4"/>
+          <w:insideH w:val="single" w:color="auto" w:sz="4"/>
+          <w:insideV w:val="single" w:color="auto" w:sz="4"/>
+        </w:tblBorders>
+      </w:tblPr>
+      <w:tblGrid>
+        <w:gridCol w:w="9638"/>
+      </w:tblGrid>
+      <w:tr>
+        <w:trPr>
+          <w:trHeight w:val="480"/>
+        </w:trPr>
+        <w:tc>
+          <w:tcPr>
+            <w:tcW w:type="dxa" w:w="9638"/>
+            <w:tcBorders>
+              <w:top w:val="single" w:color="E0E0E0" w:sz="4"/>
+              <w:left w:val="single" w:color="E0E0E0" w:sz="4"/>
+              <w:bottom w:val="single" w:color="E0E0E0" w:sz="4"/>
+              <w:right w:val="single" w:color="E0E0E0" w:sz="4"/>
+            </w:tcBorders>
+            <w:shd w:fill="FAFAFA" w:val="clear"/>
+            <w:tcMar>
+              <w:top w:type="dxa" w:w="60"/>
+              <w:left w:type="dxa" w:w="160"/>
+              <w:bottom w:type="dxa" w:w="60"/>
+              <w:right w:type="dxa" w:w="160"/>
+            </w:tcMar>
+          </w:tcPr>
+          <w:p>
+            <w:r>
+              <w:rPr>
+                <w:sz w:val="22"/>
+                <w:szCs w:val="22"/>
+              </w:rPr>
+              <w:t xml:space="preserve"/>
+            </w:r>
+          </w:p>
+        </w:tc>
+      </w:tr>
+    </w:tbl>
+    <w:p>
+      <w:pPr>
+        <w:spacing w:after="120"/>
+      </w:pPr>
+    </w:p>
+    <w:tbl>
+      <w:tblPr>
+        <w:tblW w:type="dxa" w:w="9638"/>
+        <w:tblBorders>
+          <w:top w:val="single" w:color="auto" w:sz="4"/>
+          <w:left w:val="single" w:color="auto" w:sz="4"/>
+          <w:bottom w:val="single" w:color="auto" w:sz="4"/>
+          <w:right w:val="single" w:color="auto" w:sz="4"/>
+          <w:insideH w:val="single" w:color="auto" w:sz="4"/>
+          <w:insideV w:val="single" w:color="auto" w:sz="4"/>
+        </w:tblBorders>
+      </w:tblPr>
+      <w:tblGrid>
+        <w:gridCol w:w="9638"/>
+      </w:tblGrid>
+      <w:tr>
+        <w:tc>
+          <w:tcPr>
+            <w:tcW w:type="dxa" w:w="9638"/>
+            <w:tcBorders>
+              <w:top w:val="none" w:color="FFFFFF" w:sz="0"/>
+              <w:left w:val="none" w:color="FFFFFF" w:sz="0"/>
+              <w:bottom w:val="none" w:color="FFFFFF" w:sz="0"/>
+              <w:right w:val="none" w:color="FFFFFF" w:sz="0"/>
+            </w:tcBorders>
+            <w:shd w:fill="3949AB" w:val="clear"/>
+            <w:tcMar>
+              <w:top w:type="dxa" w:w="80"/>
+              <w:left w:type="dxa" w:w="160"/>
+              <w:bottom w:type="dxa" w:w="80"/>
+              <w:right w:type="dxa" w:w="160"/>
+            </w:tcMar>
+          </w:tcPr>
+          <w:p>
+            <w:r>
+              <w:rPr>
+                <w:rFonts w:ascii="Arial" w:cs="Arial" w:eastAsia="Arial" w:hAnsi="Arial"/>
+                <w:b/>
+                <w:bCs/>
+                <w:color w:val="FFFFFF"/>
+                <w:sz w:val="20"/>
+                <w:szCs w:val="20"/>
+              </w:rPr>
+              <w:t xml:space="preserve">📸 Salida de aws s3 ls en tu terminal, y el listado de buckets en la consola de S3</w:t>
             </w:r>
           </w:p>
         </w:tc>

</xml_diff>